<commit_message>
Update report file and remove selected chart from gallery
Made-with: Cursor
</commit_message>
<xml_diff>
--- a/project-cumulative-workload-player-injuries-207677808.docx
+++ b/project-cumulative-workload-player-injuries-207677808.docx
@@ -557,13 +557,7 @@
         <w:rPr>
           <w:rtl/>
         </w:rPr>
-        <w:t>8</w:t>
-      </w:r>
-      <w:r>
-        <w:rPr>
-          <w:rtl/>
-        </w:rPr>
-        <w:t xml:space="preserve"> </w:t>
+        <w:t xml:space="preserve">8 </w:t>
       </w:r>
       <w:r>
         <w:rPr>
@@ -3558,7 +3552,65 @@
         <w:rPr>
           <w:rtl/>
         </w:rPr>
-        <w:t>שאלות אלה הובילו לשיחה עם דור מורג, ראש מערך האנליזה של קבוצת שארלוט הורנטס. מורג ציין כי ההחלטה על שיתוף שחקן במשחק מסוים מתקבלת בפועל על ידי הרופא של הקבוצה ולא על ידי מערך האנליזה. זה מדגיש פער שהמחקר לא יכול לגשר עליו: ה</w:t>
+        <w:t xml:space="preserve">שאלות אלה הובילו לשיחה </w:t>
+      </w:r>
+      <w:r>
+        <w:rPr>
+          <w:rFonts w:hint="cs"/>
+          <w:rtl/>
+        </w:rPr>
+        <w:t>עם אחד מ</w:t>
+      </w:r>
+      <w:r>
+        <w:rPr>
+          <w:rtl/>
+        </w:rPr>
+        <w:t>ראש</w:t>
+      </w:r>
+      <w:r>
+        <w:rPr>
+          <w:rFonts w:hint="cs"/>
+          <w:rtl/>
+        </w:rPr>
+        <w:t>י האנליזה של קבוצות ה-</w:t>
+      </w:r>
+      <w:r>
+        <w:rPr>
+          <w:lang w:val="en-US"/>
+        </w:rPr>
+        <w:t>NBA</w:t>
+      </w:r>
+      <w:r>
+        <w:rPr>
+          <w:rtl/>
+        </w:rPr>
+        <w:t xml:space="preserve">. </w:t>
+      </w:r>
+      <w:r>
+        <w:rPr>
+          <w:rFonts w:hint="cs"/>
+          <w:rtl/>
+        </w:rPr>
+        <w:t>הוא</w:t>
+      </w:r>
+      <w:r>
+        <w:rPr>
+          <w:rtl/>
+        </w:rPr>
+        <w:t xml:space="preserve"> ציין</w:t>
+      </w:r>
+      <w:r>
+        <w:rPr>
+          <w:rFonts w:hint="cs"/>
+          <w:rtl/>
+        </w:rPr>
+        <w:t xml:space="preserve"> בפני</w:t>
+      </w:r>
+      <w:r>
+        <w:rPr>
+          <w:rtl/>
+        </w:rPr>
+        <w:t xml:space="preserve"> כי ההחלטה על שיתוף שחקן במשחק מסוים מתקבלת בפועל על ידי הרופא של הקבוצה ולא על ידי מערך האנליזה. זה מדגיש פער שהמחקר לא יכול לגשר עליו: ה</w:t>
       </w:r>
       <w:r>
         <w:rPr>
@@ -3586,7 +3638,33 @@
         <w:rPr>
           <w:rtl/>
         </w:rPr>
-        <w:t>שיחה זו מעלה שאלה שלישית. מורג ציין שההחלטות מתקבלות על בסיס מדדים פיזיולוגיים פנימיים שאין גישה אליהם בנתונים הציבוריים. השאלה העולה היא האם החלטות אלה מתקבלות בצורה אופטימלית. כלומר, ייתכן שרופאי הקבוצות מייחסים חשיבות יתר למדדים מסוימים ומזניחים אחרים מתוך מגבלות הידע הרפואי או הטיות מסוימות שחשופים אליהן. מחקר עם גישה לנתונים פנימיים יוכל לבדוק האם קיים פער בין ההחלטה הרפואית בפועל לבין החלטה המיטבית בסיטואציה נתונה.</w:t>
+        <w:t xml:space="preserve">שיחה זו מעלה שאלה שלישית. </w:t>
+      </w:r>
+      <w:r>
+        <w:rPr>
+          <w:rFonts w:hint="cs"/>
+          <w:rtl/>
+        </w:rPr>
+        <w:t xml:space="preserve">הוא </w:t>
+      </w:r>
+      <w:r>
+        <w:rPr>
+          <w:rtl/>
+        </w:rPr>
+        <w:t>ציין</w:t>
+      </w:r>
+      <w:r>
+        <w:rPr>
+          <w:rFonts w:hint="cs"/>
+          <w:rtl/>
+        </w:rPr>
+        <w:t xml:space="preserve"> בפני</w:t>
+      </w:r>
+      <w:r>
+        <w:rPr>
+          <w:rtl/>
+        </w:rPr>
+        <w:t xml:space="preserve"> שההחלטות מתקבלות על בסיס מדדים פיזיולוגיים פנימיים שאין גישה אליהם בנתונים הציבוריים. השאלה העולה היא האם החלטות אלה מתקבלות בצורה אופטימלית. כלומר, ייתכן שרופאי הקבוצות מייחסים חשיבות יתר למדדים מסוימים ומזניחים אחרים מתוך מגבלות הידע הרפואי או הטיות מסוימות שחשופים אליהן. מחקר עם גישה לנתונים פנימיים יוכל לבדוק האם קיים פער בין ההחלטה הרפואית בפועל לבין החלטה המיטבית בסיטואציה נתונה.</w:t>
       </w:r>
     </w:p>
     <w:p>

</xml_diff>